<commit_message>
Add AIGC directions with evidence, hypotheses and downloads
</commit_message>
<xml_diff>
--- a/topics/downloads/papers.docx
+++ b/topics/downloads/papers.docx
@@ -2672,6 +2672,14 @@
       <ns0:pPr>
         <ns0:pStyle ns0:val="Normal"/>
       </ns0:pPr>
+      <ns0:r>
+        <ns0:t xml:space="preserve">AIGC 支撑方向：AIGC-C</ns0:t>
+      </ns0:r>
+    </ns0:p>
+    <ns0:p>
+      <ns0:pPr>
+        <ns0:pStyle ns0:val="Normal"/>
+      </ns0:pPr>
       <ns0:hyperlink ns1:id="rId33">
         <ns0:r>
           <ns0:rPr>
@@ -4902,6 +4910,14 @@
       <ns0:pPr>
         <ns0:pStyle ns0:val="Normal"/>
       </ns0:pPr>
+      <ns0:r>
+        <ns0:t xml:space="preserve">AIGC 支撑方向：AIGC-A</ns0:t>
+      </ns0:r>
+    </ns0:p>
+    <ns0:p>
+      <ns0:pPr>
+        <ns0:pStyle ns0:val="Normal"/>
+      </ns0:pPr>
       <ns0:hyperlink ns1:id="rId62">
         <ns0:r>
           <ns0:rPr>
@@ -4980,6 +4996,14 @@
       <ns0:pPr>
         <ns0:pStyle ns0:val="Normal"/>
       </ns0:pPr>
+      <ns0:r>
+        <ns0:t xml:space="preserve">AIGC 支撑方向：AIGC-A</ns0:t>
+      </ns0:r>
+    </ns0:p>
+    <ns0:p>
+      <ns0:pPr>
+        <ns0:pStyle ns0:val="Normal"/>
+      </ns0:pPr>
       <ns0:hyperlink ns1:id="rId63">
         <ns0:r>
           <ns0:rPr>
@@ -5058,6 +5082,14 @@
       <ns0:pPr>
         <ns0:pStyle ns0:val="Normal"/>
       </ns0:pPr>
+      <ns0:r>
+        <ns0:t xml:space="preserve">AIGC 支撑方向：AIGC-B</ns0:t>
+      </ns0:r>
+    </ns0:p>
+    <ns0:p>
+      <ns0:pPr>
+        <ns0:pStyle ns0:val="Normal"/>
+      </ns0:pPr>
       <ns0:hyperlink ns1:id="rId64">
         <ns0:r>
           <ns0:rPr>
@@ -5508,6 +5540,14 @@
       <ns0:pPr>
         <ns0:pStyle ns0:val="Normal"/>
       </ns0:pPr>
+      <ns0:r>
+        <ns0:t xml:space="preserve">AIGC 支撑方向：AIGC-D</ns0:t>
+      </ns0:r>
+    </ns0:p>
+    <ns0:p>
+      <ns0:pPr>
+        <ns0:pStyle ns0:val="Normal"/>
+      </ns0:pPr>
       <ns0:hyperlink ns1:id="rId71">
         <ns0:r>
           <ns0:rPr>
@@ -5820,6 +5860,14 @@
       <ns0:pPr>
         <ns0:pStyle ns0:val="Normal"/>
       </ns0:pPr>
+      <ns0:r>
+        <ns0:t xml:space="preserve">AIGC 支撑方向：AIGC-C</ns0:t>
+      </ns0:r>
+    </ns0:p>
+    <ns0:p>
+      <ns0:pPr>
+        <ns0:pStyle ns0:val="Normal"/>
+      </ns0:pPr>
       <ns0:hyperlink ns1:id="rId75">
         <ns0:r>
           <ns0:rPr>
@@ -6522,6 +6570,14 @@
       <ns0:pPr>
         <ns0:pStyle ns0:val="Normal"/>
       </ns0:pPr>
+      <ns0:r>
+        <ns0:t xml:space="preserve">AIGC 支撑方向：AIGC-C</ns0:t>
+      </ns0:r>
+    </ns0:p>
+    <ns0:p>
+      <ns0:pPr>
+        <ns0:pStyle ns0:val="Normal"/>
+      </ns0:pPr>
       <ns0:hyperlink ns1:id="rId84">
         <ns0:r>
           <ns0:rPr>
@@ -6678,6 +6734,14 @@
       <ns0:pPr>
         <ns0:pStyle ns0:val="Normal"/>
       </ns0:pPr>
+      <ns0:r>
+        <ns0:t xml:space="preserve">AIGC 支撑方向：AIGC-D</ns0:t>
+      </ns0:r>
+    </ns0:p>
+    <ns0:p>
+      <ns0:pPr>
+        <ns0:pStyle ns0:val="Normal"/>
+      </ns0:pPr>
       <ns0:hyperlink ns1:id="rId86">
         <ns0:r>
           <ns0:rPr>
@@ -6770,6 +6834,14 @@
       <ns0:pPr>
         <ns0:pStyle ns0:val="Normal"/>
       </ns0:pPr>
+      <ns0:r>
+        <ns0:t xml:space="preserve">AIGC 支撑方向：AIGC-B</ns0:t>
+      </ns0:r>
+    </ns0:p>
+    <ns0:p>
+      <ns0:pPr>
+        <ns0:pStyle ns0:val="Normal"/>
+      </ns0:pPr>
       <ns0:hyperlink ns1:id="rId88">
         <ns0:r>
           <ns0:rPr>
@@ -6848,6 +6920,14 @@
       <ns0:pPr>
         <ns0:pStyle ns0:val="Normal"/>
       </ns0:pPr>
+      <ns0:r>
+        <ns0:t xml:space="preserve">AIGC 支撑方向：AIGC-B</ns0:t>
+      </ns0:r>
+    </ns0:p>
+    <ns0:p>
+      <ns0:pPr>
+        <ns0:pStyle ns0:val="Normal"/>
+      </ns0:pPr>
       <ns0:hyperlink ns1:id="rId89">
         <ns0:r>
           <ns0:rPr>
@@ -7266,6 +7346,14 @@
       <ns0:pPr>
         <ns0:pStyle ns0:val="Normal"/>
       </ns0:pPr>
+      <ns0:r>
+        <ns0:t xml:space="preserve">AIGC 支撑方向：AIGC-D</ns0:t>
+      </ns0:r>
+    </ns0:p>
+    <ns0:p>
+      <ns0:pPr>
+        <ns0:pStyle ns0:val="Normal"/>
+      </ns0:pPr>
       <ns0:hyperlink ns1:id="rId96">
         <ns0:r>
           <ns0:rPr>
@@ -7344,6 +7432,14 @@
       <ns0:pPr>
         <ns0:pStyle ns0:val="Normal"/>
       </ns0:pPr>
+      <ns0:r>
+        <ns0:t xml:space="preserve">AIGC 支撑方向：AIGC-B</ns0:t>
+      </ns0:r>
+    </ns0:p>
+    <ns0:p>
+      <ns0:pPr>
+        <ns0:pStyle ns0:val="Normal"/>
+      </ns0:pPr>
       <ns0:hyperlink ns1:id="rId97">
         <ns0:r>
           <ns0:rPr>
@@ -10712,6 +10808,14 @@
       <ns0:pPr>
         <ns0:pStyle ns0:val="Normal"/>
       </ns0:pPr>
+      <ns0:r>
+        <ns0:t xml:space="preserve">AIGC 支撑方向：AIGC-A</ns0:t>
+      </ns0:r>
+    </ns0:p>
+    <ns0:p>
+      <ns0:pPr>
+        <ns0:pStyle ns0:val="Normal"/>
+      </ns0:pPr>
       <ns0:hyperlink ns1:id="rId141">
         <ns0:r>
           <ns0:rPr>
@@ -11816,6 +11920,14 @@
       <ns0:pPr>
         <ns0:pStyle ns0:val="Normal"/>
       </ns0:pPr>
+      <ns0:r>
+        <ns0:t xml:space="preserve">AIGC 支撑方向：AIGC-A / AIGC-D</ns0:t>
+      </ns0:r>
+    </ns0:p>
+    <ns0:p>
+      <ns0:pPr>
+        <ns0:pStyle ns0:val="Normal"/>
+      </ns0:pPr>
       <ns0:hyperlink ns1:id="rId157">
         <ns0:r>
           <ns0:rPr>
@@ -12532,6 +12644,14 @@
       <ns0:pPr>
         <ns0:pStyle ns0:val="Normal"/>
       </ns0:pPr>
+      <ns0:r>
+        <ns0:t xml:space="preserve">AIGC 支撑方向：AIGC-D</ns0:t>
+      </ns0:r>
+    </ns0:p>
+    <ns0:p>
+      <ns0:pPr>
+        <ns0:pStyle ns0:val="Normal"/>
+      </ns0:pPr>
       <ns0:hyperlink ns1:id="rId167">
         <ns0:r>
           <ns0:rPr>
@@ -12610,6 +12730,14 @@
       <ns0:pPr>
         <ns0:pStyle ns0:val="Normal"/>
       </ns0:pPr>
+      <ns0:r>
+        <ns0:t xml:space="preserve">AIGC 支撑方向：AIGC-D</ns0:t>
+      </ns0:r>
+    </ns0:p>
+    <ns0:p>
+      <ns0:pPr>
+        <ns0:pStyle ns0:val="Normal"/>
+      </ns0:pPr>
       <ns0:hyperlink ns1:id="rId168">
         <ns0:r>
           <ns0:rPr>
@@ -21330,6 +21458,14 @@
       <ns0:pPr>
         <ns0:pStyle ns0:val="Normal"/>
       </ns0:pPr>
+      <ns0:r>
+        <ns0:t xml:space="preserve">AIGC 支撑方向：AIGC-D</ns0:t>
+      </ns0:r>
+    </ns0:p>
+    <ns0:p>
+      <ns0:pPr>
+        <ns0:pStyle ns0:val="Normal"/>
+      </ns0:pPr>
       <ns0:hyperlink ns1:id="rId284">
         <ns0:r>
           <ns0:rPr>
@@ -25432,6 +25568,14 @@
       <ns0:pPr>
         <ns0:pStyle ns0:val="Normal"/>
       </ns0:pPr>
+      <ns0:r>
+        <ns0:t xml:space="preserve">AIGC 支撑方向：AIGC-A</ns0:t>
+      </ns0:r>
+    </ns0:p>
+    <ns0:p>
+      <ns0:pPr>
+        <ns0:pStyle ns0:val="Normal"/>
+      </ns0:pPr>
       <ns0:hyperlink ns1:id="rId337">
         <ns0:r>
           <ns0:rPr>
@@ -27898,6 +28042,14 @@
       <ns0:pPr>
         <ns0:pStyle ns0:val="Normal"/>
       </ns0:pPr>
+      <ns0:r>
+        <ns0:t xml:space="preserve">AIGC 支撑方向：AIGC-C</ns0:t>
+      </ns0:r>
+    </ns0:p>
+    <ns0:p>
+      <ns0:pPr>
+        <ns0:pStyle ns0:val="Normal"/>
+      </ns0:pPr>
       <ns0:hyperlink ns1:id="rId372">
         <ns0:r>
           <ns0:rPr>
@@ -28990,6 +29142,14 @@
       <ns0:pPr>
         <ns0:pStyle ns0:val="Normal"/>
       </ns0:pPr>
+      <ns0:r>
+        <ns0:t xml:space="preserve">AIGC 支撑方向：AIGC-B / AIGC-C</ns0:t>
+      </ns0:r>
+    </ns0:p>
+    <ns0:p>
+      <ns0:pPr>
+        <ns0:pStyle ns0:val="Normal"/>
+      </ns0:pPr>
       <ns0:hyperlink ns1:id="rId386">
         <ns0:r>
           <ns0:rPr>
@@ -29458,6 +29618,14 @@
       <ns0:pPr>
         <ns0:pStyle ns0:val="Normal"/>
       </ns0:pPr>
+      <ns0:r>
+        <ns0:t xml:space="preserve">AIGC 支撑方向：AIGC-D</ns0:t>
+      </ns0:r>
+    </ns0:p>
+    <ns0:p>
+      <ns0:pPr>
+        <ns0:pStyle ns0:val="Normal"/>
+      </ns0:pPr>
       <ns0:hyperlink ns1:id="rId392">
         <ns0:r>
           <ns0:rPr>
@@ -32000,6 +32168,14 @@
       <ns0:pPr>
         <ns0:pStyle ns0:val="Normal"/>
       </ns0:pPr>
+      <ns0:r>
+        <ns0:t xml:space="preserve">AIGC 支撑方向：AIGC-A</ns0:t>
+      </ns0:r>
+    </ns0:p>
+    <ns0:p>
+      <ns0:pPr>
+        <ns0:pStyle ns0:val="Normal"/>
+      </ns0:pPr>
       <ns0:hyperlink ns1:id="rId425">
         <ns0:r>
           <ns0:rPr>
@@ -35024,6 +35200,14 @@
       <ns0:pPr>
         <ns0:pStyle ns0:val="Normal"/>
       </ns0:pPr>
+      <ns0:r>
+        <ns0:t xml:space="preserve">AIGC 支撑方向：AIGC-B</ns0:t>
+      </ns0:r>
+    </ns0:p>
+    <ns0:p>
+      <ns0:pPr>
+        <ns0:pStyle ns0:val="Normal"/>
+      </ns0:pPr>
       <ns0:hyperlink ns1:id="rId465">
         <ns0:r>
           <ns0:rPr>
@@ -36762,6 +36946,14 @@
       </ns0:pPr>
       <ns0:r>
         <ns0:t xml:space="preserve">证据：本轮重新分类；摘要、方法及边界沿用既有笔记，附本地原文供复核；依据作者提交的 arXiv 摘要与元数据进行首轮标注；全文已逐页提取，但未逐项复核方法、指标和图表。</ns0:t>
+      </ns0:r>
+    </ns0:p>
+    <ns0:p>
+      <ns0:pPr>
+        <ns0:pStyle ns0:val="Normal"/>
+      </ns0:pPr>
+      <ns0:r>
+        <ns0:t xml:space="preserve">AIGC 支撑方向：AIGC-C</ns0:t>
       </ns0:r>
     </ns0:p>
     <ns0:p>

</xml_diff>

<commit_message>
Deploying to gh-pages from @ SoniaSuns/soniasuns.github.io@50ded8abcd0693101906cfcf87a4606a588ea5b6 🚀
</commit_message>
<xml_diff>
--- a/topics/downloads/papers.docx
+++ b/topics/downloads/papers.docx
@@ -2672,6 +2672,14 @@
       <ns0:pPr>
         <ns0:pStyle ns0:val="Normal"/>
       </ns0:pPr>
+      <ns0:r>
+        <ns0:t xml:space="preserve">AIGC 支撑方向：AIGC-C</ns0:t>
+      </ns0:r>
+    </ns0:p>
+    <ns0:p>
+      <ns0:pPr>
+        <ns0:pStyle ns0:val="Normal"/>
+      </ns0:pPr>
       <ns0:hyperlink ns1:id="rId33">
         <ns0:r>
           <ns0:rPr>
@@ -4902,6 +4910,14 @@
       <ns0:pPr>
         <ns0:pStyle ns0:val="Normal"/>
       </ns0:pPr>
+      <ns0:r>
+        <ns0:t xml:space="preserve">AIGC 支撑方向：AIGC-A</ns0:t>
+      </ns0:r>
+    </ns0:p>
+    <ns0:p>
+      <ns0:pPr>
+        <ns0:pStyle ns0:val="Normal"/>
+      </ns0:pPr>
       <ns0:hyperlink ns1:id="rId62">
         <ns0:r>
           <ns0:rPr>
@@ -4980,6 +4996,14 @@
       <ns0:pPr>
         <ns0:pStyle ns0:val="Normal"/>
       </ns0:pPr>
+      <ns0:r>
+        <ns0:t xml:space="preserve">AIGC 支撑方向：AIGC-A</ns0:t>
+      </ns0:r>
+    </ns0:p>
+    <ns0:p>
+      <ns0:pPr>
+        <ns0:pStyle ns0:val="Normal"/>
+      </ns0:pPr>
       <ns0:hyperlink ns1:id="rId63">
         <ns0:r>
           <ns0:rPr>
@@ -5058,6 +5082,14 @@
       <ns0:pPr>
         <ns0:pStyle ns0:val="Normal"/>
       </ns0:pPr>
+      <ns0:r>
+        <ns0:t xml:space="preserve">AIGC 支撑方向：AIGC-B</ns0:t>
+      </ns0:r>
+    </ns0:p>
+    <ns0:p>
+      <ns0:pPr>
+        <ns0:pStyle ns0:val="Normal"/>
+      </ns0:pPr>
       <ns0:hyperlink ns1:id="rId64">
         <ns0:r>
           <ns0:rPr>
@@ -5508,6 +5540,14 @@
       <ns0:pPr>
         <ns0:pStyle ns0:val="Normal"/>
       </ns0:pPr>
+      <ns0:r>
+        <ns0:t xml:space="preserve">AIGC 支撑方向：AIGC-D</ns0:t>
+      </ns0:r>
+    </ns0:p>
+    <ns0:p>
+      <ns0:pPr>
+        <ns0:pStyle ns0:val="Normal"/>
+      </ns0:pPr>
       <ns0:hyperlink ns1:id="rId71">
         <ns0:r>
           <ns0:rPr>
@@ -5820,6 +5860,14 @@
       <ns0:pPr>
         <ns0:pStyle ns0:val="Normal"/>
       </ns0:pPr>
+      <ns0:r>
+        <ns0:t xml:space="preserve">AIGC 支撑方向：AIGC-C</ns0:t>
+      </ns0:r>
+    </ns0:p>
+    <ns0:p>
+      <ns0:pPr>
+        <ns0:pStyle ns0:val="Normal"/>
+      </ns0:pPr>
       <ns0:hyperlink ns1:id="rId75">
         <ns0:r>
           <ns0:rPr>
@@ -6522,6 +6570,14 @@
       <ns0:pPr>
         <ns0:pStyle ns0:val="Normal"/>
       </ns0:pPr>
+      <ns0:r>
+        <ns0:t xml:space="preserve">AIGC 支撑方向：AIGC-C</ns0:t>
+      </ns0:r>
+    </ns0:p>
+    <ns0:p>
+      <ns0:pPr>
+        <ns0:pStyle ns0:val="Normal"/>
+      </ns0:pPr>
       <ns0:hyperlink ns1:id="rId84">
         <ns0:r>
           <ns0:rPr>
@@ -6678,6 +6734,14 @@
       <ns0:pPr>
         <ns0:pStyle ns0:val="Normal"/>
       </ns0:pPr>
+      <ns0:r>
+        <ns0:t xml:space="preserve">AIGC 支撑方向：AIGC-D</ns0:t>
+      </ns0:r>
+    </ns0:p>
+    <ns0:p>
+      <ns0:pPr>
+        <ns0:pStyle ns0:val="Normal"/>
+      </ns0:pPr>
       <ns0:hyperlink ns1:id="rId86">
         <ns0:r>
           <ns0:rPr>
@@ -6770,6 +6834,14 @@
       <ns0:pPr>
         <ns0:pStyle ns0:val="Normal"/>
       </ns0:pPr>
+      <ns0:r>
+        <ns0:t xml:space="preserve">AIGC 支撑方向：AIGC-B</ns0:t>
+      </ns0:r>
+    </ns0:p>
+    <ns0:p>
+      <ns0:pPr>
+        <ns0:pStyle ns0:val="Normal"/>
+      </ns0:pPr>
       <ns0:hyperlink ns1:id="rId88">
         <ns0:r>
           <ns0:rPr>
@@ -6848,6 +6920,14 @@
       <ns0:pPr>
         <ns0:pStyle ns0:val="Normal"/>
       </ns0:pPr>
+      <ns0:r>
+        <ns0:t xml:space="preserve">AIGC 支撑方向：AIGC-B</ns0:t>
+      </ns0:r>
+    </ns0:p>
+    <ns0:p>
+      <ns0:pPr>
+        <ns0:pStyle ns0:val="Normal"/>
+      </ns0:pPr>
       <ns0:hyperlink ns1:id="rId89">
         <ns0:r>
           <ns0:rPr>
@@ -7266,6 +7346,14 @@
       <ns0:pPr>
         <ns0:pStyle ns0:val="Normal"/>
       </ns0:pPr>
+      <ns0:r>
+        <ns0:t xml:space="preserve">AIGC 支撑方向：AIGC-D</ns0:t>
+      </ns0:r>
+    </ns0:p>
+    <ns0:p>
+      <ns0:pPr>
+        <ns0:pStyle ns0:val="Normal"/>
+      </ns0:pPr>
       <ns0:hyperlink ns1:id="rId96">
         <ns0:r>
           <ns0:rPr>
@@ -7344,6 +7432,14 @@
       <ns0:pPr>
         <ns0:pStyle ns0:val="Normal"/>
       </ns0:pPr>
+      <ns0:r>
+        <ns0:t xml:space="preserve">AIGC 支撑方向：AIGC-B</ns0:t>
+      </ns0:r>
+    </ns0:p>
+    <ns0:p>
+      <ns0:pPr>
+        <ns0:pStyle ns0:val="Normal"/>
+      </ns0:pPr>
       <ns0:hyperlink ns1:id="rId97">
         <ns0:r>
           <ns0:rPr>
@@ -10712,6 +10808,14 @@
       <ns0:pPr>
         <ns0:pStyle ns0:val="Normal"/>
       </ns0:pPr>
+      <ns0:r>
+        <ns0:t xml:space="preserve">AIGC 支撑方向：AIGC-A</ns0:t>
+      </ns0:r>
+    </ns0:p>
+    <ns0:p>
+      <ns0:pPr>
+        <ns0:pStyle ns0:val="Normal"/>
+      </ns0:pPr>
       <ns0:hyperlink ns1:id="rId141">
         <ns0:r>
           <ns0:rPr>
@@ -11816,6 +11920,14 @@
       <ns0:pPr>
         <ns0:pStyle ns0:val="Normal"/>
       </ns0:pPr>
+      <ns0:r>
+        <ns0:t xml:space="preserve">AIGC 支撑方向：AIGC-A / AIGC-D</ns0:t>
+      </ns0:r>
+    </ns0:p>
+    <ns0:p>
+      <ns0:pPr>
+        <ns0:pStyle ns0:val="Normal"/>
+      </ns0:pPr>
       <ns0:hyperlink ns1:id="rId157">
         <ns0:r>
           <ns0:rPr>
@@ -12532,6 +12644,14 @@
       <ns0:pPr>
         <ns0:pStyle ns0:val="Normal"/>
       </ns0:pPr>
+      <ns0:r>
+        <ns0:t xml:space="preserve">AIGC 支撑方向：AIGC-D</ns0:t>
+      </ns0:r>
+    </ns0:p>
+    <ns0:p>
+      <ns0:pPr>
+        <ns0:pStyle ns0:val="Normal"/>
+      </ns0:pPr>
       <ns0:hyperlink ns1:id="rId167">
         <ns0:r>
           <ns0:rPr>
@@ -12610,6 +12730,14 @@
       <ns0:pPr>
         <ns0:pStyle ns0:val="Normal"/>
       </ns0:pPr>
+      <ns0:r>
+        <ns0:t xml:space="preserve">AIGC 支撑方向：AIGC-D</ns0:t>
+      </ns0:r>
+    </ns0:p>
+    <ns0:p>
+      <ns0:pPr>
+        <ns0:pStyle ns0:val="Normal"/>
+      </ns0:pPr>
       <ns0:hyperlink ns1:id="rId168">
         <ns0:r>
           <ns0:rPr>
@@ -21330,6 +21458,14 @@
       <ns0:pPr>
         <ns0:pStyle ns0:val="Normal"/>
       </ns0:pPr>
+      <ns0:r>
+        <ns0:t xml:space="preserve">AIGC 支撑方向：AIGC-D</ns0:t>
+      </ns0:r>
+    </ns0:p>
+    <ns0:p>
+      <ns0:pPr>
+        <ns0:pStyle ns0:val="Normal"/>
+      </ns0:pPr>
       <ns0:hyperlink ns1:id="rId284">
         <ns0:r>
           <ns0:rPr>
@@ -25432,6 +25568,14 @@
       <ns0:pPr>
         <ns0:pStyle ns0:val="Normal"/>
       </ns0:pPr>
+      <ns0:r>
+        <ns0:t xml:space="preserve">AIGC 支撑方向：AIGC-A</ns0:t>
+      </ns0:r>
+    </ns0:p>
+    <ns0:p>
+      <ns0:pPr>
+        <ns0:pStyle ns0:val="Normal"/>
+      </ns0:pPr>
       <ns0:hyperlink ns1:id="rId337">
         <ns0:r>
           <ns0:rPr>
@@ -27898,6 +28042,14 @@
       <ns0:pPr>
         <ns0:pStyle ns0:val="Normal"/>
       </ns0:pPr>
+      <ns0:r>
+        <ns0:t xml:space="preserve">AIGC 支撑方向：AIGC-C</ns0:t>
+      </ns0:r>
+    </ns0:p>
+    <ns0:p>
+      <ns0:pPr>
+        <ns0:pStyle ns0:val="Normal"/>
+      </ns0:pPr>
       <ns0:hyperlink ns1:id="rId372">
         <ns0:r>
           <ns0:rPr>
@@ -28990,6 +29142,14 @@
       <ns0:pPr>
         <ns0:pStyle ns0:val="Normal"/>
       </ns0:pPr>
+      <ns0:r>
+        <ns0:t xml:space="preserve">AIGC 支撑方向：AIGC-B / AIGC-C</ns0:t>
+      </ns0:r>
+    </ns0:p>
+    <ns0:p>
+      <ns0:pPr>
+        <ns0:pStyle ns0:val="Normal"/>
+      </ns0:pPr>
       <ns0:hyperlink ns1:id="rId386">
         <ns0:r>
           <ns0:rPr>
@@ -29458,6 +29618,14 @@
       <ns0:pPr>
         <ns0:pStyle ns0:val="Normal"/>
       </ns0:pPr>
+      <ns0:r>
+        <ns0:t xml:space="preserve">AIGC 支撑方向：AIGC-D</ns0:t>
+      </ns0:r>
+    </ns0:p>
+    <ns0:p>
+      <ns0:pPr>
+        <ns0:pStyle ns0:val="Normal"/>
+      </ns0:pPr>
       <ns0:hyperlink ns1:id="rId392">
         <ns0:r>
           <ns0:rPr>
@@ -32000,6 +32168,14 @@
       <ns0:pPr>
         <ns0:pStyle ns0:val="Normal"/>
       </ns0:pPr>
+      <ns0:r>
+        <ns0:t xml:space="preserve">AIGC 支撑方向：AIGC-A</ns0:t>
+      </ns0:r>
+    </ns0:p>
+    <ns0:p>
+      <ns0:pPr>
+        <ns0:pStyle ns0:val="Normal"/>
+      </ns0:pPr>
       <ns0:hyperlink ns1:id="rId425">
         <ns0:r>
           <ns0:rPr>
@@ -35024,6 +35200,14 @@
       <ns0:pPr>
         <ns0:pStyle ns0:val="Normal"/>
       </ns0:pPr>
+      <ns0:r>
+        <ns0:t xml:space="preserve">AIGC 支撑方向：AIGC-B</ns0:t>
+      </ns0:r>
+    </ns0:p>
+    <ns0:p>
+      <ns0:pPr>
+        <ns0:pStyle ns0:val="Normal"/>
+      </ns0:pPr>
       <ns0:hyperlink ns1:id="rId465">
         <ns0:r>
           <ns0:rPr>
@@ -36762,6 +36946,14 @@
       </ns0:pPr>
       <ns0:r>
         <ns0:t xml:space="preserve">证据：本轮重新分类；摘要、方法及边界沿用既有笔记，附本地原文供复核；依据作者提交的 arXiv 摘要与元数据进行首轮标注；全文已逐页提取，但未逐项复核方法、指标和图表。</ns0:t>
+      </ns0:r>
+    </ns0:p>
+    <ns0:p>
+      <ns0:pPr>
+        <ns0:pStyle ns0:val="Normal"/>
+      </ns0:pPr>
+      <ns0:r>
+        <ns0:t xml:space="preserve">AIGC 支撑方向：AIGC-C</ns0:t>
       </ns0:r>
     </ns0:p>
     <ns0:p>

</xml_diff>